<commit_message>
Lab 6 dry-run fixes (L6-1 blocker Flow, Description__c, Check 2 reset, Lab 7 corrected) + Day 2 Verify fixes (D2-1 through D2-6)
</commit_message>
<xml_diff>
--- a/workshop-site/labs/Lab 06 - Participant.docx
+++ b/workshop-site/labs/Lab 06 - Participant.docx
@@ -25,7 +25,7 @@
           <w:color w:val="6A6A6A"/>
           <w:sz w:val="20"/>
         </w:rPr>
-        <w:t>ServicePulse 360 Workshop v0.7 (revision 12) | Estimated time: 115 minutes | Add platform capabilities on top of the Service Disruption object: a Validation Rule, a Record-Triggered Flow, a Quick Action that calls Prompt Builder, an Approval Process for publishing rider-facing messages, and a Report plus a Dashboard. This is where the data model becomes a working platform.</w:t>
+        <w:t>ServicePulse 360 Workshop v0.7 (revision 13) | Estimated time: 115 minutes | Add platform capabilities on top of the Service Disruption object: a Validation Rule, a Record-Triggered Flow, a Quick Action that calls Prompt Builder, an Approval Process for publishing rider-facing messages, and a Report plus a Dashboard. This is where the data model becomes a working platform.</w:t>
       </w:r>
     </w:p>
     <w:p>
@@ -323,10 +323,7 @@
         <w:ind w:left="680" w:hanging="227"/>
       </w:pPr>
       <w:r>
-        <w:t xml:space="preserve">• </w:t>
-      </w:r>
-      <w:r>
-        <w:t>NOT(ISBLANK(Disruption_Cleared_Date_Time__c)) &amp;&amp; NOT(ISBLANK(Disruption_Start_Date_Time__c)) &amp;&amp; Disruption_Cleared_Date_Time__c &lt;= Disruption_Start_Date_Time__c</w:t>
+        <w:t xml:space="preserve">• NOT(ISBLANK(Disruption_Cleared_Date_Time__c)) &amp;&amp; NOT(ISBLANK(Disruption_Start_Date_Time__c)) &amp;&amp; Disruption_Cleared_Date_Time__c &lt;= Disruption_Start_Date_Time__c</w:t>
       </w:r>
     </w:p>
     <w:p>
@@ -615,10 +612,7 @@
         <w:ind w:left="680" w:hanging="227"/>
       </w:pPr>
       <w:r>
-        <w:t xml:space="preserve">• </w:t>
-      </w:r>
-      <w:r>
-        <w:t>ISCHANGED({!$Record.Status__c}) &amp;&amp; ISPICKVAL({!$Record.Status__c}, "Active")</w:t>
+        <w:t xml:space="preserve">• ISCHANGED({!$Record.Status__c}) &amp;&amp; ISPICKVAL({!$Record.Status__c}, "Active")</w:t>
       </w:r>
     </w:p>
     <w:p>
@@ -633,7 +627,7 @@
         <w:t xml:space="preserve">5. </w:t>
       </w:r>
       <w:r>
-        <w:t>When to Run the Flow for Updated Records: select the radio button for "Only when a record is updated to meet the condition requirements." This prevents the Flow from re-firing every time a Service Disruption that is already Active gets saved for any other reason.</w:t>
+        <w:t>When to Run the Flow for Updated Records: leave the default "Every time a record is updated and meets the condition requirements." The ISCHANGED function in your formula already prevents the Flow from re-firing when Status does not change, so the stricter radio option is not needed here (and in fact Salesforce rejects the combination of ISCHANGED and the stricter radio).</w:t>
       </w:r>
     </w:p>
     <w:p>
@@ -789,10 +783,7 @@
         <w:ind w:left="680" w:hanging="227"/>
       </w:pPr>
       <w:r>
-        <w:t xml:space="preserve">• </w:t>
-      </w:r>
-      <w:r>
-        <w:t>First condition: Field: Service_Disruption__c. Operator: Equals. For Value, click into the resource picker. Under Quick Resources, click Triggering Service Disruption. Then under Record Fields, click Record ID. The value populates as {!$Record.Id}.</w:t>
+        <w:t xml:space="preserve">• First condition: Field: Service_Disruption__c. Operator: Equals. For Value, click into the resource picker. Under Quick Resources, click Triggering Service Disruption. Then under Record Fields, click Record ID. The value populates as {!$Record.Id}.</w:t>
       </w:r>
     </w:p>
     <w:p>
@@ -801,10 +792,7 @@
         <w:ind w:left="680" w:hanging="227"/>
       </w:pPr>
       <w:r>
-        <w:t xml:space="preserve">• </w:t>
-      </w:r>
-      <w:r>
-        <w:t>Second condition (click Add Condition): Field: Status. Operator: Does Not Equal. Value: Closed.</w:t>
+        <w:t xml:space="preserve">• Second condition (click Add Condition): Field: Status. Operator: Does Not Equal. Value: Closed.</w:t>
       </w:r>
     </w:p>
     <w:p>
@@ -828,10 +816,7 @@
         <w:ind w:left="680" w:hanging="227"/>
       </w:pPr>
       <w:r>
-        <w:t xml:space="preserve">• </w:t>
-      </w:r>
-      <w:r>
-        <w:t>Field: Status. Value: Escalated.</w:t>
+        <w:t xml:space="preserve">• Field: Status. Value: Escalated.</w:t>
       </w:r>
     </w:p>
     <w:p>
@@ -1195,10 +1180,7 @@
         <w:ind w:left="680" w:hanging="227"/>
       </w:pPr>
       <w:r>
-        <w:t xml:space="preserve">• </w:t>
-      </w:r>
-      <w:r>
-        <w:t>Name: Service Disruption</w:t>
+        <w:t xml:space="preserve">• Name: Service Disruption</w:t>
       </w:r>
     </w:p>
     <w:p>
@@ -1207,10 +1189,7 @@
         <w:ind w:left="680" w:hanging="227"/>
       </w:pPr>
       <w:r>
-        <w:t xml:space="preserve">• </w:t>
-      </w:r>
-      <w:r>
-        <w:t>API Name: Service_Disruption (auto-fills)</w:t>
+        <w:t xml:space="preserve">• API Name: Service_Disruption (auto-fills)</w:t>
       </w:r>
     </w:p>
     <w:p>
@@ -1219,10 +1198,7 @@
         <w:ind w:left="680" w:hanging="227"/>
       </w:pPr>
       <w:r>
-        <w:t xml:space="preserve">• </w:t>
-      </w:r>
-      <w:r>
-        <w:t>Source Type: Object (select from dropdown)</w:t>
+        <w:t xml:space="preserve">• Source Type: Object (select from dropdown)</w:t>
       </w:r>
     </w:p>
     <w:p>
@@ -1231,10 +1207,7 @@
         <w:ind w:left="680" w:hanging="227"/>
       </w:pPr>
       <w:r>
-        <w:t xml:space="preserve">• </w:t>
-      </w:r>
-      <w:r>
-        <w:t>Object: click the search icon and pick Service Disruption</w:t>
+        <w:t xml:space="preserve">• Object: click the search icon and pick Service Disruption</w:t>
       </w:r>
     </w:p>
     <w:p>
@@ -1320,10 +1293,7 @@
         <w:ind w:left="680" w:hanging="227"/>
       </w:pPr>
       <w:r>
-        <w:t xml:space="preserve">• </w:t>
-      </w:r>
-      <w:r>
-        <w:t>You are the MTA Digital Communications Team drafter. Given a service disruption with the following details, write a concise rider-facing message under 280 characters in the MTA public communications voice: calm, informative, specific. Include the affected transit line, the issue in plain language, any delay estimate, and (if known) alternative routes. Do not use jargon. Use "we" to speak for MTA.</w:t>
+        <w:t xml:space="preserve">• You are the MTA Digital Communications Team drafter. Given a service disruption with the following details, write a concise rider-facing message under 280 characters in the MTA public communications voice: calm, informative, specific. Include the affected transit line, the issue in plain language, any delay estimate, and (if known) alternative routes. Do not use jargon. Use "we" to speak for MTA.</w:t>
       </w:r>
     </w:p>
     <w:p>
@@ -1334,7 +1304,6 @@
       <w:r>
         <w:t xml:space="preserve">• </w:t>
       </w:r>
-      <w:r/>
     </w:p>
     <w:p>
       <w:pPr>
@@ -1342,10 +1311,7 @@
         <w:ind w:left="680" w:hanging="227"/>
       </w:pPr>
       <w:r>
-        <w:t xml:space="preserve">• </w:t>
-      </w:r>
-      <w:r>
-        <w:t>Service Disruption details:</w:t>
+        <w:t xml:space="preserve">• Service Disruption details:</w:t>
       </w:r>
     </w:p>
     <w:p>
@@ -1400,10 +1366,7 @@
         <w:ind w:left="680" w:hanging="227"/>
       </w:pPr>
       <w:r>
-        <w:t xml:space="preserve">• </w:t>
-      </w:r>
-      <w:r>
-        <w:t>Headline (API: Headline__c)</w:t>
+        <w:t xml:space="preserve">• Headline (API: Headline__c)</w:t>
       </w:r>
     </w:p>
     <w:p>
@@ -1412,10 +1375,7 @@
         <w:ind w:left="680" w:hanging="227"/>
       </w:pPr>
       <w:r>
-        <w:t xml:space="preserve">• </w:t>
-      </w:r>
-      <w:r>
-        <w:t>Description (API: Public_Description__c)</w:t>
+        <w:t xml:space="preserve">• Description (API: Description__c)</w:t>
       </w:r>
     </w:p>
     <w:p>
@@ -1424,10 +1384,7 @@
         <w:ind w:left="680" w:hanging="227"/>
       </w:pPr>
       <w:r>
-        <w:t xml:space="preserve">• </w:t>
-      </w:r>
-      <w:r>
-        <w:t>Affected Line (API: Affected_Line__c)</w:t>
+        <w:t xml:space="preserve">• Affected Line (API: Affected_Line__c)</w:t>
       </w:r>
     </w:p>
     <w:p>
@@ -1436,10 +1393,7 @@
         <w:ind w:left="680" w:hanging="227"/>
       </w:pPr>
       <w:r>
-        <w:t xml:space="preserve">• </w:t>
-      </w:r>
-      <w:r>
-        <w:t>Severity (API: Severity__c)</w:t>
+        <w:t xml:space="preserve">• Severity (API: Severity__c)</w:t>
       </w:r>
     </w:p>
     <w:p>
@@ -1463,10 +1417,7 @@
         <w:ind w:left="680" w:hanging="227"/>
       </w:pPr>
       <w:r>
-        <w:t xml:space="preserve">• </w:t>
-      </w:r>
-      <w:r>
-        <w:t>Return only the rider-facing message text. No preamble, no quotes, no caveats.</w:t>
+        <w:t xml:space="preserve">• Return only the rider-facing message text. No preamble, no quotes, no caveats.</w:t>
       </w:r>
     </w:p>
     <w:p>
@@ -1799,10 +1750,7 @@
         <w:ind w:left="680" w:hanging="227"/>
       </w:pPr>
       <w:r>
-        <w:t xml:space="preserve">• </w:t>
-      </w:r>
-      <w:r>
-        <w:t>Field: Record ID. Operator: Equals. Value: {!recordId}.</w:t>
+        <w:t xml:space="preserve">• Field: Record ID. Operator: Equals. Value: {!recordId}.</w:t>
       </w:r>
     </w:p>
     <w:p>
@@ -2207,10 +2155,7 @@
         <w:ind w:left="680" w:hanging="227"/>
       </w:pPr>
       <w:r>
-        <w:t xml:space="preserve">• </w:t>
-      </w:r>
-      <w:r>
-        <w:t>Field: Record ID. Operator: Equals. Value: {!recordId}.</w:t>
+        <w:t xml:space="preserve">• Field: Record ID. Operator: Equals. Value: {!recordId}.</w:t>
       </w:r>
     </w:p>
     <w:p>
@@ -2234,10 +2179,7 @@
         <w:ind w:left="680" w:hanging="227"/>
       </w:pPr>
       <w:r>
-        <w:t xml:space="preserve">• </w:t>
-      </w:r>
-      <w:r>
-        <w:t>Field: Rider-Facing Message. For Value, click into the resource picker. Navigate: Review Draft &gt; Draft Rider Message. The value populates as {!Draft_Rider_Message}.</w:t>
+        <w:t xml:space="preserve">• Field: Rider-Facing Message. For Value, click into the resource picker. Navigate: Review Draft &gt; Draft Rider Message. The value populates as {!Draft_Rider_Message}.</w:t>
       </w:r>
     </w:p>
     <w:p>
@@ -3040,10 +2982,7 @@
         <w:ind w:left="680" w:hanging="227"/>
       </w:pPr>
       <w:r>
-        <w:t xml:space="preserve">• </w:t>
-      </w:r>
-      <w:r>
-        <w:t>Field: open the Field dropdown and select Service Disruption: Rider-Facing Message.</w:t>
+        <w:t xml:space="preserve">• Field: open the Field dropdown and select Service Disruption: Rider-Facing Message.</w:t>
       </w:r>
     </w:p>
     <w:p>
@@ -3052,10 +2991,7 @@
         <w:ind w:left="680" w:hanging="227"/>
       </w:pPr>
       <w:r>
-        <w:t xml:space="preserve">• </w:t>
-      </w:r>
-      <w:r>
-        <w:t>Operator: select not equal to.</w:t>
+        <w:t xml:space="preserve">• Operator: select not equal to.</w:t>
       </w:r>
     </w:p>
     <w:p>
@@ -3064,10 +3000,7 @@
         <w:ind w:left="680" w:hanging="227"/>
       </w:pPr>
       <w:r>
-        <w:t xml:space="preserve">• </w:t>
-      </w:r>
-      <w:r>
-        <w:t>Value: leave the Value box EMPTY. (An empty Value with a 'not equal to' operator means the Rider-Facing Message must be populated for the approval process to fire.)</w:t>
+        <w:t xml:space="preserve">• Value: leave the Value box EMPTY. (An empty Value with a 'not equal to' operator means the Rider-Facing Message must be populated for the approval process to fire.)</w:t>
       </w:r>
     </w:p>
     <w:p>
@@ -3107,10 +3040,7 @@
         <w:ind w:left="680" w:hanging="227"/>
       </w:pPr>
       <w:r>
-        <w:t xml:space="preserve">• </w:t>
-      </w:r>
-      <w:r>
-        <w:t>Select the radio button for "Automatically assign to approver(s)".</w:t>
+        <w:t xml:space="preserve">• Select the radio button for "Automatically assign to approver(s)".</w:t>
       </w:r>
     </w:p>
     <w:p>
@@ -3119,10 +3049,7 @@
         <w:ind w:left="680" w:hanging="227"/>
       </w:pPr>
       <w:r>
-        <w:t xml:space="preserve">• </w:t>
-      </w:r>
-      <w:r>
-        <w:t>In the row below, leave the dropdown set to User.</w:t>
+        <w:t xml:space="preserve">• In the row below, leave the dropdown set to User.</w:t>
       </w:r>
     </w:p>
     <w:p>
@@ -3131,10 +3058,7 @@
         <w:ind w:left="680" w:hanging="227"/>
       </w:pPr>
       <w:r>
-        <w:t xml:space="preserve">• </w:t>
-      </w:r>
-      <w:r>
-        <w:t>Click the lookup icon (magnifying glass) next to the User field. Search for your own name and select yourself as the approver. (This lets you approve your own submission for the workshop demo.)</w:t>
+        <w:t xml:space="preserve">• Click the lookup icon (magnifying glass) next to the User field. Search for your own name and select yourself as the approver. (This lets you approve your own submission for the workshop demo.)</w:t>
       </w:r>
     </w:p>
     <w:p>
@@ -3143,10 +3067,7 @@
         <w:ind w:left="680" w:hanging="227"/>
       </w:pPr>
       <w:r>
-        <w:t xml:space="preserve">• </w:t>
-      </w:r>
-      <w:r>
-        <w:t>When multiple approvers are selected: leave the default "Approve or reject based on the FIRST response."</w:t>
+        <w:t xml:space="preserve">• When multiple approvers are selected: leave the default "Approve or reject based on the FIRST response."</w:t>
       </w:r>
     </w:p>
     <w:p>
@@ -3779,10 +3700,7 @@
         <w:ind w:left="680" w:hanging="227"/>
       </w:pPr>
       <w:r>
-        <w:t xml:space="preserve">• </w:t>
-      </w:r>
-      <w:r>
-        <w:t>Show Me: All service disruptions.</w:t>
+        <w:t xml:space="preserve">• Show Me: All service disruptions.</w:t>
       </w:r>
     </w:p>
     <w:p>
@@ -3791,10 +3709,7 @@
         <w:ind w:left="680" w:hanging="227"/>
       </w:pPr>
       <w:r>
-        <w:t xml:space="preserve">• </w:t>
-      </w:r>
-      <w:r>
-        <w:t>Created Date: All Time.</w:t>
+        <w:t xml:space="preserve">• Created Date: All Time.</w:t>
       </w:r>
     </w:p>
     <w:p>
@@ -3803,10 +3718,7 @@
         <w:ind w:left="680" w:hanging="227"/>
       </w:pPr>
       <w:r>
-        <w:t xml:space="preserve">• </w:t>
-      </w:r>
-      <w:r>
-        <w:t>Status: not equal to Cleared.</w:t>
+        <w:t xml:space="preserve">• Status: not equal to Cleared.</w:t>
       </w:r>
     </w:p>
     <w:p>
@@ -3890,10 +3802,7 @@
         <w:ind w:left="680" w:hanging="227"/>
       </w:pPr>
       <w:r>
-        <w:t xml:space="preserve">• </w:t>
-      </w:r>
-      <w:r>
-        <w:t>Service Disruption: Headline</w:t>
+        <w:t xml:space="preserve">• Service Disruption: Headline</w:t>
       </w:r>
     </w:p>
     <w:p>
@@ -3902,10 +3811,7 @@
         <w:ind w:left="680" w:hanging="227"/>
       </w:pPr>
       <w:r>
-        <w:t xml:space="preserve">• </w:t>
-      </w:r>
-      <w:r>
-        <w:t>Service Disruption: Status</w:t>
+        <w:t xml:space="preserve">• Service Disruption: Status</w:t>
       </w:r>
     </w:p>
     <w:p>
@@ -3914,10 +3820,7 @@
         <w:ind w:left="680" w:hanging="227"/>
       </w:pPr>
       <w:r>
-        <w:t xml:space="preserve">• </w:t>
-      </w:r>
-      <w:r>
-        <w:t>Service Disruption: Severity</w:t>
+        <w:t xml:space="preserve">• Service Disruption: Severity</w:t>
       </w:r>
     </w:p>
     <w:p>
@@ -3926,10 +3829,7 @@
         <w:ind w:left="680" w:hanging="227"/>
       </w:pPr>
       <w:r>
-        <w:t xml:space="preserve">• </w:t>
-      </w:r>
-      <w:r>
-        <w:t>Service Disruption: Affected Line</w:t>
+        <w:t xml:space="preserve">• Service Disruption: Affected Line</w:t>
       </w:r>
     </w:p>
     <w:p>
@@ -3938,10 +3838,7 @@
         <w:ind w:left="680" w:hanging="227"/>
       </w:pPr>
       <w:r>
-        <w:t xml:space="preserve">• </w:t>
-      </w:r>
-      <w:r>
-        <w:t>Service Disruption: Created Date</w:t>
+        <w:t xml:space="preserve">• Service Disruption: Created Date</w:t>
       </w:r>
     </w:p>
     <w:p>
@@ -4147,10 +4044,7 @@
         <w:ind w:left="680" w:hanging="227"/>
       </w:pPr>
       <w:r>
-        <w:t xml:space="preserve">• </w:t>
-      </w:r>
-      <w:r>
-        <w:t>Remove Status: not equal to Cleared (click the X on the pill).</w:t>
+        <w:t xml:space="preserve">• Remove Status: not equal to Cleared (click the X on the pill).</w:t>
       </w:r>
     </w:p>
     <w:p>
@@ -4159,10 +4053,7 @@
         <w:ind w:left="680" w:hanging="227"/>
       </w:pPr>
       <w:r>
-        <w:t xml:space="preserve">• </w:t>
-      </w:r>
-      <w:r>
-        <w:t>Add Duration (Minutes): greater than 0. This excludes disruptions without both timestamps.</w:t>
+        <w:t xml:space="preserve">• Add Duration (Minutes): greater than 0. This excludes disruptions without both timestamps.</w:t>
       </w:r>
     </w:p>
     <w:p>
@@ -4231,10 +4122,7 @@
         <w:ind w:left="680" w:hanging="227"/>
       </w:pPr>
       <w:r>
-        <w:t xml:space="preserve">• </w:t>
-      </w:r>
-      <w:r>
-        <w:t>Service Disruption: Disruption Start Date/Time</w:t>
+        <w:t xml:space="preserve">• Service Disruption: Disruption Start Date/Time</w:t>
       </w:r>
     </w:p>
     <w:p>
@@ -4243,10 +4131,7 @@
         <w:ind w:left="680" w:hanging="227"/>
       </w:pPr>
       <w:r>
-        <w:t xml:space="preserve">• </w:t>
-      </w:r>
-      <w:r>
-        <w:t>Service Disruption: Disruption Cleared Date/Time</w:t>
+        <w:t xml:space="preserve">• Service Disruption: Disruption Cleared Date/Time</w:t>
       </w:r>
     </w:p>
     <w:p>
@@ -4255,10 +4140,7 @@
         <w:ind w:left="680" w:hanging="227"/>
       </w:pPr>
       <w:r>
-        <w:t xml:space="preserve">• </w:t>
-      </w:r>
-      <w:r>
-        <w:t>Service Disruption: Duration (Minutes)</w:t>
+        <w:t xml:space="preserve">• Service Disruption: Duration (Minutes)</w:t>
       </w:r>
     </w:p>
     <w:p>
@@ -4760,7 +4642,7 @@
         <w:t xml:space="preserve">1. </w:t>
       </w:r>
       <w:r>
-        <w:t>Change SD-00001's Status to Active. Related Case Status becomes Escalated automatically.</w:t>
+        <w:t>First, reset the test state: set your Golden Case Status back to New, save it, then set SD-00001's Status back to Declared, save that. Now change SD-00001's Status to Active. Related Case Status becomes Escalated automatically.</w:t>
       </w:r>
     </w:p>
     <w:p>
@@ -4924,7 +4806,7 @@
         <w:spacing w:after="40"/>
       </w:pPr>
       <w:r>
-        <w:t>Submit for Approval button missing: add it to the Service Disruption Layout's Buttons section via Page Layouts.</w:t>
+        <w:t>Submit for Approval button missing: Part 3.6 upgraded the Service Disruption page to Dynamic Actions, so adding the button via Page Layouts does not help. Confirm Part 4.6 added the Submit for Approval button via Dynamic Actions in Lightning App Builder.</w:t>
       </w:r>
     </w:p>
     <w:p>
@@ -4951,7 +4833,7 @@
     </w:p>
     <w:p>
       <w:r>
-        <w:t>Lab 7 (next session) is the Executive Scenario Simulation. You'll run the full ServicePulse 360 stack end-to-end: a disruption is declared, Cases roll in and auto-escalate, a Work Order dispatches, Prompt Builder drafts the rider message, Approval Process gates it, Dashboard reflects the live state. The capstone where everything you built from Lab 1 through Lab 6 moves together in a single scenario.</w:t>
+        <w:t>Lab 7 (Day 2 afternoon) is the Agentforce Dispatcher Assistant, where you'll wrap all of today's capabilities inside an agent that can reason over your Service Disruption records. The optional Executive Scenario Simulation runs after Lab 7 as a Day 2 wrap exercise. You'll run the full ServicePulse 360 stack end-to-end: a disruption is declared, Cases roll in and auto-escalate, a Work Order dispatches, Prompt Builder drafts the rider message, Approval Process gates it, Dashboard reflects the live state. The capstone where everything you built from Lab 1 through Lab 6 moves together in a single scenario.</w:t>
       </w:r>
     </w:p>
     <w:sectPr>

</xml_diff>